<commit_message>
Enable the NPU compiler to handle models with up to 4 input channels (input channel count ≤ 4) and no limitation on the number of output channels.
some edit
</commit_message>
<xml_diff>
--- a/docx/NPU指令手册.docx
+++ b/docx/NPU指令手册.docx
@@ -494,12 +494,6 @@
             <w:insideH w:val="single" w:color="auto" w:sz="4" w:space="0"/>
             <w:insideV w:val="single" w:color="auto" w:sz="4" w:space="0"/>
           </w:tblBorders>
-          <w:tblCellMar>
-            <w:top w:w="0" w:type="dxa"/>
-            <w:left w:w="108" w:type="dxa"/>
-            <w:bottom w:w="0" w:type="dxa"/>
-            <w:right w:w="108" w:type="dxa"/>
-          </w:tblCellMar>
         </w:tblPrEx>
         <w:tc>
           <w:tcPr>
@@ -901,12 +895,6 @@
             <w:insideH w:val="single" w:color="auto" w:sz="4" w:space="0"/>
             <w:insideV w:val="single" w:color="auto" w:sz="4" w:space="0"/>
           </w:tblBorders>
-          <w:tblCellMar>
-            <w:top w:w="0" w:type="dxa"/>
-            <w:left w:w="108" w:type="dxa"/>
-            <w:bottom w:w="0" w:type="dxa"/>
-            <w:right w:w="108" w:type="dxa"/>
-          </w:tblCellMar>
         </w:tblPrEx>
         <w:tc>
           <w:tcPr>
@@ -1772,6 +1760,12 @@
             <w:insideH w:val="single" w:color="auto" w:sz="4" w:space="0"/>
             <w:insideV w:val="single" w:color="auto" w:sz="4" w:space="0"/>
           </w:tblBorders>
+          <w:tblCellMar>
+            <w:top w:w="0" w:type="dxa"/>
+            <w:left w:w="108" w:type="dxa"/>
+            <w:bottom w:w="0" w:type="dxa"/>
+            <w:right w:w="108" w:type="dxa"/>
+          </w:tblCellMar>
         </w:tblPrEx>
         <w:trPr>
           <w:jc w:val="center"/>
@@ -2945,12 +2939,6 @@
             <w:insideH w:val="single" w:color="auto" w:sz="4" w:space="0"/>
             <w:insideV w:val="single" w:color="auto" w:sz="4" w:space="0"/>
           </w:tblBorders>
-          <w:tblCellMar>
-            <w:top w:w="0" w:type="dxa"/>
-            <w:left w:w="108" w:type="dxa"/>
-            <w:bottom w:w="0" w:type="dxa"/>
-            <w:right w:w="108" w:type="dxa"/>
-          </w:tblCellMar>
         </w:tblPrEx>
         <w:tc>
           <w:tcPr>
@@ -4918,12 +4906,6 @@
             <w:insideH w:val="single" w:color="auto" w:sz="4" w:space="0"/>
             <w:insideV w:val="single" w:color="auto" w:sz="4" w:space="0"/>
           </w:tblBorders>
-          <w:tblCellMar>
-            <w:top w:w="0" w:type="dxa"/>
-            <w:left w:w="108" w:type="dxa"/>
-            <w:bottom w:w="0" w:type="dxa"/>
-            <w:right w:w="108" w:type="dxa"/>
-          </w:tblCellMar>
         </w:tblPrEx>
         <w:tc>
           <w:tcPr>
@@ -6338,12 +6320,6 @@
             <w:insideH w:val="single" w:color="auto" w:sz="4" w:space="0"/>
             <w:insideV w:val="single" w:color="auto" w:sz="4" w:space="0"/>
           </w:tblBorders>
-          <w:tblCellMar>
-            <w:top w:w="0" w:type="dxa"/>
-            <w:left w:w="108" w:type="dxa"/>
-            <w:bottom w:w="0" w:type="dxa"/>
-            <w:right w:w="108" w:type="dxa"/>
-          </w:tblCellMar>
         </w:tblPrEx>
         <w:tc>
           <w:tcPr>
@@ -7722,6 +7698,7 @@
     <w:p>
       <w:pPr>
         <w:numPr>
+          <w:ilvl w:val="0"/>
           <w:numId w:val="0"/>
         </w:numPr>
         <w:rPr>
@@ -7736,8 +7713,6 @@
         </w:rPr>
         <w:t>Eg：矩阵组A有4通道（4个矩阵A1,A2,A3,A4），矩阵组B有4通道（4个矩阵B1,B2,B3,B4）,那么矩阵组A和组B累加会得到4通道矩阵组C(C1=A1+B1,C2=A2+B2,C3=A3+B3,C4=A4+B4)。</w:t>
       </w:r>
-      <w:bookmarkStart w:id="2" w:name="_GoBack"/>
-      <w:bookmarkEnd w:id="2"/>
     </w:p>
     <w:p>
       <w:r>
@@ -7786,12 +7761,6 @@
             <w:insideH w:val="single" w:color="auto" w:sz="4" w:space="0"/>
             <w:insideV w:val="single" w:color="auto" w:sz="4" w:space="0"/>
           </w:tblBorders>
-          <w:tblCellMar>
-            <w:top w:w="0" w:type="dxa"/>
-            <w:left w:w="108" w:type="dxa"/>
-            <w:bottom w:w="0" w:type="dxa"/>
-            <w:right w:w="108" w:type="dxa"/>
-          </w:tblCellMar>
         </w:tblPrEx>
         <w:tc>
           <w:tcPr>
@@ -8208,6 +8177,12 @@
             <w:insideH w:val="single" w:color="auto" w:sz="4" w:space="0"/>
             <w:insideV w:val="single" w:color="auto" w:sz="4" w:space="0"/>
           </w:tblBorders>
+          <w:tblCellMar>
+            <w:top w:w="0" w:type="dxa"/>
+            <w:left w:w="108" w:type="dxa"/>
+            <w:bottom w:w="0" w:type="dxa"/>
+            <w:right w:w="108" w:type="dxa"/>
+          </w:tblCellMar>
         </w:tblPrEx>
         <w:trPr>
           <w:jc w:val="center"/>
@@ -8514,6 +8489,25 @@
           <w:rFonts w:ascii="Arial" w:hAnsi="Arial"/>
         </w:rPr>
         <w:t>对应二进制编码：</w:t>
+      </w:r>
+      <w:r>
+        <w:rPr>
+          <w:rFonts w:hint="eastAsia" w:asciiTheme="minorHAnsi" w:hAnsiTheme="minorHAnsi"/>
+        </w:rPr>
+        <w:t>存储</w:t>
+      </w:r>
+      <w:r>
+        <w:rPr>
+          <w:rFonts w:hint="eastAsia" w:asciiTheme="minorHAnsi" w:hAnsiTheme="minorHAnsi"/>
+          <w:lang w:val="en-US" w:eastAsia="zh-CN"/>
+        </w:rPr>
+        <w:t>第2组矩阵地址</w:t>
+      </w:r>
+      <w:r>
+        <w:rPr>
+          <w:rFonts w:hint="eastAsia" w:asciiTheme="minorHAnsi" w:hAnsiTheme="minorHAnsi"/>
+        </w:rPr>
+        <w:t>的NPU寄存器编号</w:t>
       </w:r>
     </w:p>
     <w:tbl>
@@ -8892,6 +8886,20 @@
           <w:p>
             <w:r>
               <w:rPr>
+                <w:rFonts w:hint="eastAsia"/>
+                <w:lang w:val="en-US" w:eastAsia="zh-CN"/>
+              </w:rPr>
+              <w:t>存储计算结果写回地址的NPU寄存器编号</w:t>
+            </w:r>
+          </w:p>
+        </w:tc>
+        <w:tc>
+          <w:tcPr>
+            <w:tcW w:w="892" w:type="pct"/>
+          </w:tcPr>
+          <w:p>
+            <w:r>
+              <w:rPr>
                 <w:rFonts w:hint="eastAsia" w:asciiTheme="minorHAnsi" w:hAnsiTheme="minorHAnsi"/>
               </w:rPr>
               <w:t>存储</w:t>
@@ -8910,11 +8918,6 @@
               <w:t>的NPU寄存器编号</w:t>
             </w:r>
           </w:p>
-        </w:tc>
-        <w:tc>
-          <w:tcPr>
-            <w:tcW w:w="892" w:type="pct"/>
-          </w:tcPr>
           <w:p>
             <w:pPr>
               <w:rPr>
@@ -8922,13 +8925,6 @@
                 <w:lang w:val="en-US" w:eastAsia="zh-CN"/>
               </w:rPr>
             </w:pPr>
-            <w:r>
-              <w:rPr>
-                <w:rFonts w:hint="eastAsia"/>
-                <w:lang w:val="en-US" w:eastAsia="zh-CN"/>
-              </w:rPr>
-              <w:t>存储计算结果写回地址的NPU寄存器编号</w:t>
-            </w:r>
           </w:p>
         </w:tc>
         <w:tc>
@@ -9189,7 +9185,7 @@
                 <w:sz w:val="20"/>
                 <w:lang w:val="en-US" w:eastAsia="zh-CN"/>
               </w:rPr>
-              <w:t>2</w:t>
+              <w:t>3</w:t>
             </w:r>
             <w:r>
               <w:br w:type="textWrapping"/>
@@ -9245,7 +9241,7 @@
                 <w:sz w:val="20"/>
                 <w:lang w:val="en-US" w:eastAsia="zh-CN"/>
               </w:rPr>
-              <w:t>3</w:t>
+              <w:t>2</w:t>
             </w:r>
             <w:r>
               <w:br w:type="textWrapping"/>
@@ -9421,7 +9417,15 @@
                 <w:rFonts w:ascii="Arial" w:hAnsi="Arial"/>
                 <w:sz w:val="20"/>
               </w:rPr>
-              <w:t>000001 00010 00000 0000000000000010</w:t>
+              <w:t>000001 00010 00000 000000000000001</w:t>
+            </w:r>
+            <w:r>
+              <w:rPr>
+                <w:rFonts w:hint="eastAsia" w:ascii="Arial" w:hAnsi="Arial"/>
+                <w:sz w:val="20"/>
+                <w:lang w:val="en-US" w:eastAsia="zh-CN"/>
+              </w:rPr>
+              <w:t>1</w:t>
             </w:r>
             <w:r>
               <w:br w:type="textWrapping"/>
@@ -9463,8 +9467,10 @@
                 <w:sz w:val="20"/>
                 <w:lang w:val="en-US" w:eastAsia="zh-CN"/>
               </w:rPr>
-              <w:t>1</w:t>
-            </w:r>
+              <w:t>0</w:t>
+            </w:r>
+            <w:bookmarkStart w:id="2" w:name="_GoBack"/>
+            <w:bookmarkEnd w:id="2"/>
             <w:r>
               <w:br w:type="textWrapping"/>
             </w:r>
@@ -10102,12 +10108,6 @@
             <w:insideH w:val="single" w:color="auto" w:sz="4" w:space="0"/>
             <w:insideV w:val="single" w:color="auto" w:sz="4" w:space="0"/>
           </w:tblBorders>
-          <w:tblCellMar>
-            <w:top w:w="0" w:type="dxa"/>
-            <w:left w:w="108" w:type="dxa"/>
-            <w:bottom w:w="0" w:type="dxa"/>
-            <w:right w:w="108" w:type="dxa"/>
-          </w:tblCellMar>
         </w:tblPrEx>
         <w:tc>
           <w:tcPr>

</xml_diff>